<commit_message>
Update Day 5 assignment submission documents
Refresh the Assignment 8 DOCX source and PDF submission with the latest local document changes.

Keep the editable document and exported submission synchronized for the Day 5 training materials.
</commit_message>
<xml_diff>
--- a/DAY5/Day5_Assignment_8.docx
+++ b/DAY5/Day5_Assignment_8.docx
@@ -53,7 +53,6 @@
           <w:ilvl w:val="0"/>
           <w:numId w:val="5"/>
         </w:numPr>
-        <w:jc w:val="both"/>
         <w:rPr>
           <w:rFonts w:ascii="Times New Roman" w:hAnsi="Times New Roman" w:cs="Times New Roman"/>
         </w:rPr>
@@ -75,6 +74,21 @@
           <w:rFonts w:ascii="Times New Roman" w:hAnsi="Times New Roman" w:cs="Times New Roman"/>
         </w:rPr>
         <w:t xml:space="preserve">: </w:t>
+      </w:r>
+      <w:hyperlink r:id="rId6" w:history="1">
+        <w:r>
+          <w:rPr>
+            <w:rStyle w:val="Hyperlink"/>
+            <w:rFonts w:ascii="Times New Roman" w:hAnsi="Times New Roman" w:cs="Times New Roman"/>
+          </w:rPr>
+          <w:t>https://github.com/ssbagi/IBM_OpenPOWER_and_SoC_Design</w:t>
+        </w:r>
+      </w:hyperlink>
+      <w:r>
+        <w:rPr>
+          <w:rFonts w:ascii="Times New Roman" w:hAnsi="Times New Roman" w:cs="Times New Roman"/>
+        </w:rPr>
+        <w:t xml:space="preserve"> </w:t>
       </w:r>
     </w:p>
     <w:p>
@@ -84,28 +98,30 @@
           <w:ilvl w:val="0"/>
           <w:numId w:val="5"/>
         </w:numPr>
-        <w:jc w:val="both"/>
-        <w:rPr>
-          <w:rFonts w:ascii="Times New Roman" w:hAnsi="Times New Roman" w:cs="Times New Roman"/>
-        </w:rPr>
-      </w:pPr>
-      <w:r>
-        <w:rPr>
-          <w:rFonts w:ascii="Times New Roman" w:hAnsi="Times New Roman" w:cs="Times New Roman"/>
-        </w:rPr>
-        <w:t>README.md</w:t>
-      </w:r>
+        <w:rPr>
+          <w:rFonts w:ascii="Times New Roman" w:hAnsi="Times New Roman" w:cs="Times New Roman"/>
+        </w:rPr>
+      </w:pPr>
+      <w:r>
+        <w:rPr>
+          <w:rFonts w:ascii="Times New Roman" w:hAnsi="Times New Roman" w:cs="Times New Roman"/>
+        </w:rPr>
+        <w:t xml:space="preserve">Assignment 8 : </w:t>
+      </w:r>
+      <w:hyperlink r:id="rId7" w:history="1">
+        <w:r>
+          <w:rPr>
+            <w:rStyle w:val="Hyperlink"/>
+            <w:rFonts w:ascii="Times New Roman" w:hAnsi="Times New Roman" w:cs="Times New Roman"/>
+          </w:rPr>
+          <w:t>https://github.com/ssbagi/IBM_OpenPOWER_and_SoC_Design/blob/main/DAY5/Day5_Assignment_8.pdf</w:t>
+        </w:r>
+      </w:hyperlink>
       <w:r>
         <w:rPr>
           <w:rFonts w:ascii="Times New Roman" w:hAnsi="Times New Roman" w:cs="Times New Roman"/>
         </w:rPr>
         <w:t xml:space="preserve"> </w:t>
-      </w:r>
-      <w:r>
-        <w:rPr>
-          <w:rFonts w:ascii="Times New Roman" w:hAnsi="Times New Roman" w:cs="Times New Roman"/>
-        </w:rPr>
-        <w:t xml:space="preserve">: </w:t>
       </w:r>
     </w:p>
     <w:p>
@@ -749,6 +765,7 @@
         <w:rPr>
           <w:rFonts w:ascii="Times New Roman" w:hAnsi="Times New Roman" w:cs="Times New Roman"/>
         </w:rPr>
+        <w:lastRenderedPageBreak/>
         <w:t>Outputs : DMI transaction signals (dmi_addr, dmi_req and dmi_wr)</w:t>
       </w:r>
       <w:r>
@@ -1511,6 +1528,7 @@
         <w:rPr>
           <w:rFonts w:ascii="Times New Roman" w:hAnsi="Times New Roman" w:cs="Times New Roman"/>
         </w:rPr>
+        <w:lastRenderedPageBreak/>
         <w:t xml:space="preserve">The module </w:t>
       </w:r>
       <w:r>
@@ -1601,7 +1619,6 @@
         <w:rPr>
           <w:rFonts w:ascii="Times New Roman" w:hAnsi="Times New Roman" w:cs="Times New Roman"/>
         </w:rPr>
-        <w:lastRenderedPageBreak/>
         <w:t>The</w:t>
       </w:r>
       <w:r>
@@ -1662,7 +1679,7 @@
                     <pic:cNvPicPr/>
                   </pic:nvPicPr>
                   <pic:blipFill>
-                    <a:blip r:embed="rId6" cstate="print">
+                    <a:blip r:embed="rId8" cstate="print">
                       <a:extLst>
                         <a:ext uri="{28A0092B-C50C-407E-A947-70E740481C1C}">
                           <a14:useLocalDpi xmlns:a14="http://schemas.microsoft.com/office/drawing/2010/main" val="0"/>
@@ -1961,6 +1978,7 @@
         <w:rPr>
           <w:rFonts w:ascii="Times New Roman" w:hAnsi="Times New Roman" w:cs="Times New Roman"/>
         </w:rPr>
+        <w:lastRenderedPageBreak/>
         <w:drawing>
           <wp:anchor distT="0" distB="0" distL="114300" distR="114300" simplePos="0" relativeHeight="251659264" behindDoc="0" locked="0" layoutInCell="1" allowOverlap="1" wp14:anchorId="1DD123CD" wp14:editId="52297119">
             <wp:simplePos x="0" y="0"/>
@@ -1985,7 +2003,7 @@
                     <pic:cNvPicPr/>
                   </pic:nvPicPr>
                   <pic:blipFill>
-                    <a:blip r:embed="rId7">
+                    <a:blip r:embed="rId9">
                       <a:extLst>
                         <a:ext uri="{28A0092B-C50C-407E-A947-70E740481C1C}">
                           <a14:useLocalDpi xmlns:a14="http://schemas.microsoft.com/office/drawing/2010/main" val="0"/>
@@ -2328,6 +2346,7 @@
         <w:rPr>
           <w:rFonts w:ascii="Times New Roman" w:hAnsi="Times New Roman" w:cs="Times New Roman"/>
         </w:rPr>
+        <w:lastRenderedPageBreak/>
         <w:drawing>
           <wp:anchor distT="0" distB="0" distL="114300" distR="114300" simplePos="0" relativeHeight="251661312" behindDoc="0" locked="0" layoutInCell="1" allowOverlap="1" wp14:anchorId="536CD316" wp14:editId="253CF4EF">
             <wp:simplePos x="0" y="0"/>
@@ -2352,7 +2371,7 @@
                     <pic:cNvPicPr/>
                   </pic:nvPicPr>
                   <pic:blipFill>
-                    <a:blip r:embed="rId8" cstate="print">
+                    <a:blip r:embed="rId10" cstate="print">
                       <a:extLst>
                         <a:ext uri="{28A0092B-C50C-407E-A947-70E740481C1C}">
                           <a14:useLocalDpi xmlns:a14="http://schemas.microsoft.com/office/drawing/2010/main" val="0"/>
@@ -2675,7 +2694,6 @@
         <w:rPr>
           <w:rFonts w:ascii="Times New Roman" w:hAnsi="Times New Roman" w:cs="Times New Roman"/>
         </w:rPr>
-        <w:lastRenderedPageBreak/>
         <w:t>Master : Core</w:t>
       </w:r>
     </w:p>
@@ -2851,6 +2869,7 @@
         <w:rPr>
           <w:noProof/>
         </w:rPr>
+        <w:lastRenderedPageBreak/>
         <w:drawing>
           <wp:anchor distT="0" distB="0" distL="114300" distR="114300" simplePos="0" relativeHeight="251658240" behindDoc="1" locked="0" layoutInCell="1" allowOverlap="1" wp14:anchorId="74059779" wp14:editId="2925CF5A">
             <wp:simplePos x="0" y="0"/>
@@ -2883,7 +2902,7 @@
                     <pic:cNvPicPr/>
                   </pic:nvPicPr>
                   <pic:blipFill rotWithShape="1">
-                    <a:blip r:embed="rId9" cstate="print">
+                    <a:blip r:embed="rId11" cstate="print">
                       <a:extLst>
                         <a:ext uri="{28A0092B-C50C-407E-A947-70E740481C1C}">
                           <a14:useLocalDpi xmlns:a14="http://schemas.microsoft.com/office/drawing/2010/main" val="0"/>
@@ -3504,7 +3523,7 @@
                     <pic:cNvPicPr/>
                   </pic:nvPicPr>
                   <pic:blipFill>
-                    <a:blip r:embed="rId10" cstate="print">
+                    <a:blip r:embed="rId12" cstate="print">
                       <a:extLst>
                         <a:ext uri="{28A0092B-C50C-407E-A947-70E740481C1C}">
                           <a14:useLocalDpi xmlns:a14="http://schemas.microsoft.com/office/drawing/2010/main" val="0"/>
@@ -3582,7 +3601,7 @@
                     <pic:cNvPicPr/>
                   </pic:nvPicPr>
                   <pic:blipFill>
-                    <a:blip r:embed="rId11" cstate="print">
+                    <a:blip r:embed="rId13" cstate="print">
                       <a:extLst>
                         <a:ext uri="{28A0092B-C50C-407E-A947-70E740481C1C}">
                           <a14:useLocalDpi xmlns:a14="http://schemas.microsoft.com/office/drawing/2010/main" val="0"/>
@@ -6111,6 +6130,29 @@
       <w:spacing w:val="5"/>
     </w:rPr>
   </w:style>
+  <w:style w:type="character" w:styleId="Hyperlink">
+    <w:name w:val="Hyperlink"/>
+    <w:basedOn w:val="DefaultParagraphFont"/>
+    <w:uiPriority w:val="99"/>
+    <w:unhideWhenUsed/>
+    <w:rsid w:val="0096171C"/>
+    <w:rPr>
+      <w:color w:val="0563C1" w:themeColor="hyperlink"/>
+      <w:u w:val="single"/>
+    </w:rPr>
+  </w:style>
+  <w:style w:type="character" w:styleId="UnresolvedMention">
+    <w:name w:val="Unresolved Mention"/>
+    <w:basedOn w:val="DefaultParagraphFont"/>
+    <w:uiPriority w:val="99"/>
+    <w:semiHidden/>
+    <w:unhideWhenUsed/>
+    <w:rsid w:val="0096171C"/>
+    <w:rPr>
+      <w:color w:val="605E5C"/>
+      <w:shd w:val="clear" w:color="auto" w:fill="E1DFDD"/>
+    </w:rPr>
+  </w:style>
 </w:styles>
 </file>
 

</xml_diff>